<commit_message>
WIP: review fixes, third snapshot (all eight fix agents reported)
Co-Authored-By: Claude Sonnet 5.5 <noreply@anthropic.com>
Claude-Session: https://claude.ai/code/session_014UaSWTtFPyVa13jKnvpa9H
</commit_message>
<xml_diff>
--- a/fixtures/saas-vendor-friendly.docx
+++ b/fixtures/saas-vendor-friendly.docx
@@ -206,7 +206,7 @@
         <w:t xml:space="preserve">5.2 </w:t>
       </w:r>
       <w:r>
-        <w:t xml:space="preserve">If availability in a month is below 99.9 percent, Vendor shall credit Customer with the service credits set out in Schedule A.</w:t>
+        <w:t xml:space="preserve">If availability in a month is below 99.9 percent, Vendor shall credit Customer ten percent (10%) of the fees for that month, or twenty-five percent (25%) of them if availability is below 99 percent.</w:t>
       </w:r>
     </w:p>
     <w:p>
@@ -221,7 +221,7 @@
         <w:t xml:space="preserve">5.3 </w:t>
       </w:r>
       <w:r>
-        <w:t xml:space="preserve">If availability is below 99 percent in any two months of a rolling six-month period, Customer may terminate this Agreement by written notice and receive a refund of prepaid fees for the remainder of the Subscription Term.</w:t>
+        <w:t xml:space="preserve">If availability is below 99 percent in any two months of a rolling six-month period, Customer may terminate this Agreement by written notice.</w:t>
       </w:r>
     </w:p>
     <w:p>

</xml_diff>